<commit_message>
fix(lab1): add requirement testability traceability
</commit_message>
<xml_diff>
--- a/docs/lab1/source/计算机23-2_231002208_戚晋瑜_实验一_ValidationReport_v1.0.docx
+++ b/docs/lab1/source/计算机23-2_231002208_戚晋瑜_实验一_ValidationReport_v1.0.docx
@@ -256,6 +256,2176 @@
         <w:t>AI 返回的主要问题集中在桌位偏好枚举、取消与爽约规则边界、推荐可解释性和活动合规授权。经人工复核后，形成如下缺陷列表。</w:t>
       </w:r>
     </w:p>
+    <w:p>
+      <w:pPr>
+        <w:pStyle w:val="Heading2"/>
+      </w:pPr>
+      <w:r>
+        <w:t>2.4 逐条需求可测试性来源标注</w:t>
+      </w:r>
+    </w:p>
+    <w:p>
+      <w:r>
+        <w:t>按照实验一任务书要求，本节对每条 FR/NFR 的可测试性来源进行显式标注，确保需求能够回链到验收准则、验证方法与预占测试用例。</w:t>
+      </w:r>
+    </w:p>
+    <w:p>
+      <w:pPr>
+        <w:jc w:val="left"/>
+      </w:pPr>
+      <w:r>
+        <w:rPr>
+          <w:b/>
+        </w:rPr>
+        <w:t>表 2-1 需求可测试性来源标注</w:t>
+      </w:r>
+    </w:p>
+    <w:tbl>
+      <w:tblPr>
+        <w:tblStyle w:val="TableGrid"/>
+        <w:tblW w:type="auto" w:w="0"/>
+        <w:tblLook w:firstColumn="1" w:firstRow="1" w:lastColumn="0" w:lastRow="0" w:noHBand="0" w:noVBand="1" w:val="04A0"/>
+      </w:tblPr>
+      <w:tblGrid>
+        <w:gridCol w:w="1729"/>
+        <w:gridCol w:w="1729"/>
+        <w:gridCol w:w="1729"/>
+        <w:gridCol w:w="1729"/>
+        <w:gridCol w:w="1729"/>
+      </w:tblGrid>
+      <w:tr>
+        <w:tc>
+          <w:tcPr>
+            <w:tcW w:type="dxa" w:w="1729"/>
+          </w:tcPr>
+          <w:p>
+            <w:r>
+              <w:t>需求ID</w:t>
+            </w:r>
+          </w:p>
+        </w:tc>
+        <w:tc>
+          <w:tcPr>
+            <w:tcW w:type="dxa" w:w="1729"/>
+          </w:tcPr>
+          <w:p>
+            <w:r>
+              <w:t>类型</w:t>
+            </w:r>
+          </w:p>
+        </w:tc>
+        <w:tc>
+          <w:tcPr>
+            <w:tcW w:type="dxa" w:w="1729"/>
+          </w:tcPr>
+          <w:p>
+            <w:r>
+              <w:t>可测试性来源</w:t>
+            </w:r>
+          </w:p>
+        </w:tc>
+        <w:tc>
+          <w:tcPr>
+            <w:tcW w:type="dxa" w:w="1729"/>
+          </w:tcPr>
+          <w:p>
+            <w:r>
+              <w:t>对应证据</w:t>
+            </w:r>
+          </w:p>
+        </w:tc>
+        <w:tc>
+          <w:tcPr>
+            <w:tcW w:type="dxa" w:w="1729"/>
+          </w:tcPr>
+          <w:p>
+            <w:r>
+              <w:t>预占测试用例</w:t>
+            </w:r>
+          </w:p>
+        </w:tc>
+      </w:tr>
+      <w:tr>
+        <w:tc>
+          <w:tcPr>
+            <w:tcW w:type="dxa" w:w="1729"/>
+          </w:tcPr>
+          <w:p>
+            <w:r>
+              <w:t>FR-001</w:t>
+            </w:r>
+          </w:p>
+        </w:tc>
+        <w:tc>
+          <w:tcPr>
+            <w:tcW w:type="dxa" w:w="1729"/>
+          </w:tcPr>
+          <w:p>
+            <w:r>
+              <w:t>功能需求</w:t>
+            </w:r>
+          </w:p>
+        </w:tc>
+        <w:tc>
+          <w:tcPr>
+            <w:tcW w:type="dxa" w:w="1729"/>
+          </w:tcPr>
+          <w:p>
+            <w:r>
+              <w:t>Given-When-Then 验收准则</w:t>
+            </w:r>
+          </w:p>
+        </w:tc>
+        <w:tc>
+          <w:tcPr>
+            <w:tcW w:type="dxa" w:w="1729"/>
+          </w:tcPr>
+          <w:p>
+            <w:r>
+              <w:t>Given 新用户访问注册页 When 提交合法信息 Then 系统创建会员账号；关联 UC-001；类图实体 Member / MemberProfile</w:t>
+            </w:r>
+          </w:p>
+        </w:tc>
+        <w:tc>
+          <w:tcPr>
+            <w:tcW w:type="dxa" w:w="1729"/>
+          </w:tcPr>
+          <w:p>
+            <w:r>
+              <w:t>TC-001</w:t>
+            </w:r>
+          </w:p>
+        </w:tc>
+      </w:tr>
+      <w:tr>
+        <w:tc>
+          <w:tcPr>
+            <w:tcW w:type="dxa" w:w="1729"/>
+          </w:tcPr>
+          <w:p>
+            <w:r>
+              <w:t>FR-002</w:t>
+            </w:r>
+          </w:p>
+        </w:tc>
+        <w:tc>
+          <w:tcPr>
+            <w:tcW w:type="dxa" w:w="1729"/>
+          </w:tcPr>
+          <w:p>
+            <w:r>
+              <w:t>功能需求</w:t>
+            </w:r>
+          </w:p>
+        </w:tc>
+        <w:tc>
+          <w:tcPr>
+            <w:tcW w:type="dxa" w:w="1729"/>
+          </w:tcPr>
+          <w:p>
+            <w:r>
+              <w:t>Given-When-Then 验收准则</w:t>
+            </w:r>
+          </w:p>
+        </w:tc>
+        <w:tc>
+          <w:tcPr>
+            <w:tcW w:type="dxa" w:w="1729"/>
+          </w:tcPr>
+          <w:p>
+            <w:r>
+              <w:t>Given 顾客进入门店页 When 选择日期 Then 返回可预约时段；关联 UC-002；类图实体 Store / BusinessCalendar</w:t>
+            </w:r>
+          </w:p>
+        </w:tc>
+        <w:tc>
+          <w:tcPr>
+            <w:tcW w:type="dxa" w:w="1729"/>
+          </w:tcPr>
+          <w:p>
+            <w:r>
+              <w:t>TC-002</w:t>
+            </w:r>
+          </w:p>
+        </w:tc>
+      </w:tr>
+      <w:tr>
+        <w:tc>
+          <w:tcPr>
+            <w:tcW w:type="dxa" w:w="1729"/>
+          </w:tcPr>
+          <w:p>
+            <w:r>
+              <w:t>FR-003</w:t>
+            </w:r>
+          </w:p>
+        </w:tc>
+        <w:tc>
+          <w:tcPr>
+            <w:tcW w:type="dxa" w:w="1729"/>
+          </w:tcPr>
+          <w:p>
+            <w:r>
+              <w:t>功能需求</w:t>
+            </w:r>
+          </w:p>
+        </w:tc>
+        <w:tc>
+          <w:tcPr>
+            <w:tcW w:type="dxa" w:w="1729"/>
+          </w:tcPr>
+          <w:p>
+            <w:r>
+              <w:t>Given-When-Then 验收准则</w:t>
+            </w:r>
+          </w:p>
+        </w:tc>
+        <w:tc>
+          <w:tcPr>
+            <w:tcW w:type="dxa" w:w="1729"/>
+          </w:tcPr>
+          <w:p>
+            <w:r>
+              <w:t>Given 顾客已选择门店与时段 When 提交预约 Then 系统生成预约记录；关联 UC-003；类图实体 Reservation / ReservationOrder</w:t>
+            </w:r>
+          </w:p>
+        </w:tc>
+        <w:tc>
+          <w:tcPr>
+            <w:tcW w:type="dxa" w:w="1729"/>
+          </w:tcPr>
+          <w:p>
+            <w:r>
+              <w:t>TC-003</w:t>
+            </w:r>
+          </w:p>
+        </w:tc>
+      </w:tr>
+      <w:tr>
+        <w:tc>
+          <w:tcPr>
+            <w:tcW w:type="dxa" w:w="1729"/>
+          </w:tcPr>
+          <w:p>
+            <w:r>
+              <w:t>FR-004</w:t>
+            </w:r>
+          </w:p>
+        </w:tc>
+        <w:tc>
+          <w:tcPr>
+            <w:tcW w:type="dxa" w:w="1729"/>
+          </w:tcPr>
+          <w:p>
+            <w:r>
+              <w:t>功能需求</w:t>
+            </w:r>
+          </w:p>
+        </w:tc>
+        <w:tc>
+          <w:tcPr>
+            <w:tcW w:type="dxa" w:w="1729"/>
+          </w:tcPr>
+          <w:p>
+            <w:r>
+              <w:t>Given-When-Then 验收准则</w:t>
+            </w:r>
+          </w:p>
+        </w:tc>
+        <w:tc>
+          <w:tcPr>
+            <w:tcW w:type="dxa" w:w="1729"/>
+          </w:tcPr>
+          <w:p>
+            <w:r>
+              <w:t>Given 存在有效预约 When 顾客取消 Then 状态更新为已取消且释放桌位；关联 UC-004；类图实体 ReservationOrder</w:t>
+            </w:r>
+          </w:p>
+        </w:tc>
+        <w:tc>
+          <w:tcPr>
+            <w:tcW w:type="dxa" w:w="1729"/>
+          </w:tcPr>
+          <w:p>
+            <w:r>
+              <w:t>TC-004</w:t>
+            </w:r>
+          </w:p>
+        </w:tc>
+      </w:tr>
+      <w:tr>
+        <w:tc>
+          <w:tcPr>
+            <w:tcW w:type="dxa" w:w="1729"/>
+          </w:tcPr>
+          <w:p>
+            <w:r>
+              <w:t>FR-005</w:t>
+            </w:r>
+          </w:p>
+        </w:tc>
+        <w:tc>
+          <w:tcPr>
+            <w:tcW w:type="dxa" w:w="1729"/>
+          </w:tcPr>
+          <w:p>
+            <w:r>
+              <w:t>功能需求</w:t>
+            </w:r>
+          </w:p>
+        </w:tc>
+        <w:tc>
+          <w:tcPr>
+            <w:tcW w:type="dxa" w:w="1729"/>
+          </w:tcPr>
+          <w:p>
+            <w:r>
+              <w:t>Given-When-Then 验收准则</w:t>
+            </w:r>
+          </w:p>
+        </w:tc>
+        <w:tc>
+          <w:tcPr>
+            <w:tcW w:type="dxa" w:w="1729"/>
+          </w:tcPr>
+          <w:p>
+            <w:r>
+              <w:t>Given 顾客进入个人中心 When 打开预约记录 Then 系统展示历史状态列表；关联 UC-004；类图实体 ReservationOrder</w:t>
+            </w:r>
+          </w:p>
+        </w:tc>
+        <w:tc>
+          <w:tcPr>
+            <w:tcW w:type="dxa" w:w="1729"/>
+          </w:tcPr>
+          <w:p>
+            <w:r>
+              <w:t>TC-005</w:t>
+            </w:r>
+          </w:p>
+        </w:tc>
+      </w:tr>
+      <w:tr>
+        <w:tc>
+          <w:tcPr>
+            <w:tcW w:type="dxa" w:w="1729"/>
+          </w:tcPr>
+          <w:p>
+            <w:r>
+              <w:t>FR-006</w:t>
+            </w:r>
+          </w:p>
+        </w:tc>
+        <w:tc>
+          <w:tcPr>
+            <w:tcW w:type="dxa" w:w="1729"/>
+          </w:tcPr>
+          <w:p>
+            <w:r>
+              <w:t>功能需求</w:t>
+            </w:r>
+          </w:p>
+        </w:tc>
+        <w:tc>
+          <w:tcPr>
+            <w:tcW w:type="dxa" w:w="1729"/>
+          </w:tcPr>
+          <w:p>
+            <w:r>
+              <w:t>Given-When-Then 验收准则</w:t>
+            </w:r>
+          </w:p>
+        </w:tc>
+        <w:tc>
+          <w:tcPr>
+            <w:tcW w:type="dxa" w:w="1729"/>
+          </w:tcPr>
+          <w:p>
+            <w:r>
+              <w:t>Given 顾客创建预约 When 选择偏好标签 Then 系统在可用桌位中优先匹配；关联 UC-003；类图实体 TableSlot</w:t>
+            </w:r>
+          </w:p>
+        </w:tc>
+        <w:tc>
+          <w:tcPr>
+            <w:tcW w:type="dxa" w:w="1729"/>
+          </w:tcPr>
+          <w:p>
+            <w:r>
+              <w:t>TC-006</w:t>
+            </w:r>
+          </w:p>
+        </w:tc>
+      </w:tr>
+      <w:tr>
+        <w:tc>
+          <w:tcPr>
+            <w:tcW w:type="dxa" w:w="1729"/>
+          </w:tcPr>
+          <w:p>
+            <w:r>
+              <w:t>FR-007</w:t>
+            </w:r>
+          </w:p>
+        </w:tc>
+        <w:tc>
+          <w:tcPr>
+            <w:tcW w:type="dxa" w:w="1729"/>
+          </w:tcPr>
+          <w:p>
+            <w:r>
+              <w:t>功能需求</w:t>
+            </w:r>
+          </w:p>
+        </w:tc>
+        <w:tc>
+          <w:tcPr>
+            <w:tcW w:type="dxa" w:w="1729"/>
+          </w:tcPr>
+          <w:p>
+            <w:r>
+              <w:t>Given-When-Then 验收准则</w:t>
+            </w:r>
+          </w:p>
+        </w:tc>
+        <w:tc>
+          <w:tcPr>
+            <w:tcW w:type="dxa" w:w="1729"/>
+          </w:tcPr>
+          <w:p>
+            <w:r>
+              <w:t>Given 顾客填写偏好 When 提交推荐请求 Then 返回包含原因说明的推荐结果；关联 UC-007；类图实体 RecommendationRule</w:t>
+            </w:r>
+          </w:p>
+        </w:tc>
+        <w:tc>
+          <w:tcPr>
+            <w:tcW w:type="dxa" w:w="1729"/>
+          </w:tcPr>
+          <w:p>
+            <w:r>
+              <w:t>TC-007</w:t>
+            </w:r>
+          </w:p>
+        </w:tc>
+      </w:tr>
+      <w:tr>
+        <w:tc>
+          <w:tcPr>
+            <w:tcW w:type="dxa" w:w="1729"/>
+          </w:tcPr>
+          <w:p>
+            <w:r>
+              <w:t>FR-008</w:t>
+            </w:r>
+          </w:p>
+        </w:tc>
+        <w:tc>
+          <w:tcPr>
+            <w:tcW w:type="dxa" w:w="1729"/>
+          </w:tcPr>
+          <w:p>
+            <w:r>
+              <w:t>功能需求</w:t>
+            </w:r>
+          </w:p>
+        </w:tc>
+        <w:tc>
+          <w:tcPr>
+            <w:tcW w:type="dxa" w:w="1729"/>
+          </w:tcPr>
+          <w:p>
+            <w:r>
+              <w:t>Given-When-Then 验收准则</w:t>
+            </w:r>
+          </w:p>
+        </w:tc>
+        <w:tc>
+          <w:tcPr>
+            <w:tcW w:type="dxa" w:w="1729"/>
+          </w:tcPr>
+          <w:p>
+            <w:r>
+              <w:t>Given 时段无可用桌位 When 顾客选择等位 Then 系统创建等位记录并告知排序；关联 UC-003；类图实体 WaitlistEntry</w:t>
+            </w:r>
+          </w:p>
+        </w:tc>
+        <w:tc>
+          <w:tcPr>
+            <w:tcW w:type="dxa" w:w="1729"/>
+          </w:tcPr>
+          <w:p>
+            <w:r>
+              <w:t>TC-008</w:t>
+            </w:r>
+          </w:p>
+        </w:tc>
+      </w:tr>
+      <w:tr>
+        <w:tc>
+          <w:tcPr>
+            <w:tcW w:type="dxa" w:w="1729"/>
+          </w:tcPr>
+          <w:p>
+            <w:r>
+              <w:t>FR-009</w:t>
+            </w:r>
+          </w:p>
+        </w:tc>
+        <w:tc>
+          <w:tcPr>
+            <w:tcW w:type="dxa" w:w="1729"/>
+          </w:tcPr>
+          <w:p>
+            <w:r>
+              <w:t>功能需求</w:t>
+            </w:r>
+          </w:p>
+        </w:tc>
+        <w:tc>
+          <w:tcPr>
+            <w:tcW w:type="dxa" w:w="1729"/>
+          </w:tcPr>
+          <w:p>
+            <w:r>
+              <w:t>Given-When-Then 验收准则</w:t>
+            </w:r>
+          </w:p>
+        </w:tc>
+        <w:tc>
+          <w:tcPr>
+            <w:tcW w:type="dxa" w:w="1729"/>
+          </w:tcPr>
+          <w:p>
+            <w:r>
+              <w:t>Given 预约创建成功 When 进入通知阶段 Then 系统发送确认消息与到店提醒；关联 UC-003；类图实体 NotificationTask</w:t>
+            </w:r>
+          </w:p>
+        </w:tc>
+        <w:tc>
+          <w:tcPr>
+            <w:tcW w:type="dxa" w:w="1729"/>
+          </w:tcPr>
+          <w:p>
+            <w:r>
+              <w:t>TC-009</w:t>
+            </w:r>
+          </w:p>
+        </w:tc>
+      </w:tr>
+      <w:tr>
+        <w:tc>
+          <w:tcPr>
+            <w:tcW w:type="dxa" w:w="1729"/>
+          </w:tcPr>
+          <w:p>
+            <w:r>
+              <w:t>FR-010</w:t>
+            </w:r>
+          </w:p>
+        </w:tc>
+        <w:tc>
+          <w:tcPr>
+            <w:tcW w:type="dxa" w:w="1729"/>
+          </w:tcPr>
+          <w:p>
+            <w:r>
+              <w:t>功能需求</w:t>
+            </w:r>
+          </w:p>
+        </w:tc>
+        <w:tc>
+          <w:tcPr>
+            <w:tcW w:type="dxa" w:w="1729"/>
+          </w:tcPr>
+          <w:p>
+            <w:r>
+              <w:t>Given-When-Then 验收准则</w:t>
+            </w:r>
+          </w:p>
+        </w:tc>
+        <w:tc>
+          <w:tcPr>
+            <w:tcW w:type="dxa" w:w="1729"/>
+          </w:tcPr>
+          <w:p>
+            <w:r>
+              <w:t>Given 顾客进入会员中心 When 打开权益页 Then 展示等级和可用权益；关联 UC-009；类图实体 LoyaltyPointAccount / Coupon</w:t>
+            </w:r>
+          </w:p>
+        </w:tc>
+        <w:tc>
+          <w:tcPr>
+            <w:tcW w:type="dxa" w:w="1729"/>
+          </w:tcPr>
+          <w:p>
+            <w:r>
+              <w:t>TC-010</w:t>
+            </w:r>
+          </w:p>
+        </w:tc>
+      </w:tr>
+      <w:tr>
+        <w:tc>
+          <w:tcPr>
+            <w:tcW w:type="dxa" w:w="1729"/>
+          </w:tcPr>
+          <w:p>
+            <w:r>
+              <w:t>FR-011</w:t>
+            </w:r>
+          </w:p>
+        </w:tc>
+        <w:tc>
+          <w:tcPr>
+            <w:tcW w:type="dxa" w:w="1729"/>
+          </w:tcPr>
+          <w:p>
+            <w:r>
+              <w:t>功能需求</w:t>
+            </w:r>
+          </w:p>
+        </w:tc>
+        <w:tc>
+          <w:tcPr>
+            <w:tcW w:type="dxa" w:w="1729"/>
+          </w:tcPr>
+          <w:p>
+            <w:r>
+              <w:t>Given-When-Then 验收准则</w:t>
+            </w:r>
+          </w:p>
+        </w:tc>
+        <w:tc>
+          <w:tcPr>
+            <w:tcW w:type="dxa" w:w="1729"/>
+          </w:tcPr>
+          <w:p>
+            <w:r>
+              <w:t>Given 订单核销成功 When 结算完成 Then 系统按规则累积积分；关联 UC-009；类图实体 LoyaltyPointAccount</w:t>
+            </w:r>
+          </w:p>
+        </w:tc>
+        <w:tc>
+          <w:tcPr>
+            <w:tcW w:type="dxa" w:w="1729"/>
+          </w:tcPr>
+          <w:p>
+            <w:r>
+              <w:t>TC-011</w:t>
+            </w:r>
+          </w:p>
+        </w:tc>
+      </w:tr>
+      <w:tr>
+        <w:tc>
+          <w:tcPr>
+            <w:tcW w:type="dxa" w:w="1729"/>
+          </w:tcPr>
+          <w:p>
+            <w:r>
+              <w:t>FR-012</w:t>
+            </w:r>
+          </w:p>
+        </w:tc>
+        <w:tc>
+          <w:tcPr>
+            <w:tcW w:type="dxa" w:w="1729"/>
+          </w:tcPr>
+          <w:p>
+            <w:r>
+              <w:t>功能需求</w:t>
+            </w:r>
+          </w:p>
+        </w:tc>
+        <w:tc>
+          <w:tcPr>
+            <w:tcW w:type="dxa" w:w="1729"/>
+          </w:tcPr>
+          <w:p>
+            <w:r>
+              <w:t>Given-When-Then 验收准则</w:t>
+            </w:r>
+          </w:p>
+        </w:tc>
+        <w:tc>
+          <w:tcPr>
+            <w:tcW w:type="dxa" w:w="1729"/>
+          </w:tcPr>
+          <w:p>
+            <w:r>
+              <w:t>Given 顾客满足使用条件 When 提交订单 Then 系统校验并抵扣优惠券；关联 UC-009；类图实体 Coupon</w:t>
+            </w:r>
+          </w:p>
+        </w:tc>
+        <w:tc>
+          <w:tcPr>
+            <w:tcW w:type="dxa" w:w="1729"/>
+          </w:tcPr>
+          <w:p>
+            <w:r>
+              <w:t>TC-012</w:t>
+            </w:r>
+          </w:p>
+        </w:tc>
+      </w:tr>
+      <w:tr>
+        <w:tc>
+          <w:tcPr>
+            <w:tcW w:type="dxa" w:w="1729"/>
+          </w:tcPr>
+          <w:p>
+            <w:r>
+              <w:t>FR-013</w:t>
+            </w:r>
+          </w:p>
+        </w:tc>
+        <w:tc>
+          <w:tcPr>
+            <w:tcW w:type="dxa" w:w="1729"/>
+          </w:tcPr>
+          <w:p>
+            <w:r>
+              <w:t>功能需求</w:t>
+            </w:r>
+          </w:p>
+        </w:tc>
+        <w:tc>
+          <w:tcPr>
+            <w:tcW w:type="dxa" w:w="1729"/>
+          </w:tcPr>
+          <w:p>
+            <w:r>
+              <w:t>Given-When-Then 验收准则</w:t>
+            </w:r>
+          </w:p>
+        </w:tc>
+        <w:tc>
+          <w:tcPr>
+            <w:tcW w:type="dxa" w:w="1729"/>
+          </w:tcPr>
+          <w:p>
+            <w:r>
+              <w:t>Given 店员进入后台 When 查看当日排班 Then 系统展示预约与桌位占用；关联 UC-005；类图实体 ShiftSchedule / TableSlot</w:t>
+            </w:r>
+          </w:p>
+        </w:tc>
+        <w:tc>
+          <w:tcPr>
+            <w:tcW w:type="dxa" w:w="1729"/>
+          </w:tcPr>
+          <w:p>
+            <w:r>
+              <w:t>TC-013</w:t>
+            </w:r>
+          </w:p>
+        </w:tc>
+      </w:tr>
+      <w:tr>
+        <w:tc>
+          <w:tcPr>
+            <w:tcW w:type="dxa" w:w="1729"/>
+          </w:tcPr>
+          <w:p>
+            <w:r>
+              <w:t>FR-014</w:t>
+            </w:r>
+          </w:p>
+        </w:tc>
+        <w:tc>
+          <w:tcPr>
+            <w:tcW w:type="dxa" w:w="1729"/>
+          </w:tcPr>
+          <w:p>
+            <w:r>
+              <w:t>功能需求</w:t>
+            </w:r>
+          </w:p>
+        </w:tc>
+        <w:tc>
+          <w:tcPr>
+            <w:tcW w:type="dxa" w:w="1729"/>
+          </w:tcPr>
+          <w:p>
+            <w:r>
+              <w:t>Given-When-Then 验收准则</w:t>
+            </w:r>
+          </w:p>
+        </w:tc>
+        <w:tc>
+          <w:tcPr>
+            <w:tcW w:type="dxa" w:w="1729"/>
+          </w:tcPr>
+          <w:p>
+            <w:r>
+              <w:t>Given 顾客到店 When 店员点击状态按钮 Then 预约订单进入下一状态；关联 UC-005；类图实体 ReservationOrder</w:t>
+            </w:r>
+          </w:p>
+        </w:tc>
+        <w:tc>
+          <w:tcPr>
+            <w:tcW w:type="dxa" w:w="1729"/>
+          </w:tcPr>
+          <w:p>
+            <w:r>
+              <w:t>TC-014</w:t>
+            </w:r>
+          </w:p>
+        </w:tc>
+      </w:tr>
+      <w:tr>
+        <w:tc>
+          <w:tcPr>
+            <w:tcW w:type="dxa" w:w="1729"/>
+          </w:tcPr>
+          <w:p>
+            <w:r>
+              <w:t>FR-015</w:t>
+            </w:r>
+          </w:p>
+        </w:tc>
+        <w:tc>
+          <w:tcPr>
+            <w:tcW w:type="dxa" w:w="1729"/>
+          </w:tcPr>
+          <w:p>
+            <w:r>
+              <w:t>功能需求</w:t>
+            </w:r>
+          </w:p>
+        </w:tc>
+        <w:tc>
+          <w:tcPr>
+            <w:tcW w:type="dxa" w:w="1729"/>
+          </w:tcPr>
+          <w:p>
+            <w:r>
+              <w:t>Given-When-Then 验收准则</w:t>
+            </w:r>
+          </w:p>
+        </w:tc>
+        <w:tc>
+          <w:tcPr>
+            <w:tcW w:type="dxa" w:w="1729"/>
+          </w:tcPr>
+          <w:p>
+            <w:r>
+              <w:t>Given 预约出现异常 When 店员选择处置方式 Then 系统记录异常并更新资源占用；关联 UC-005；类图实体 ReservationOrder / TableSlot</w:t>
+            </w:r>
+          </w:p>
+        </w:tc>
+        <w:tc>
+          <w:tcPr>
+            <w:tcW w:type="dxa" w:w="1729"/>
+          </w:tcPr>
+          <w:p>
+            <w:r>
+              <w:t>TC-015</w:t>
+            </w:r>
+          </w:p>
+        </w:tc>
+      </w:tr>
+      <w:tr>
+        <w:tc>
+          <w:tcPr>
+            <w:tcW w:type="dxa" w:w="1729"/>
+          </w:tcPr>
+          <w:p>
+            <w:r>
+              <w:t>FR-016</w:t>
+            </w:r>
+          </w:p>
+        </w:tc>
+        <w:tc>
+          <w:tcPr>
+            <w:tcW w:type="dxa" w:w="1729"/>
+          </w:tcPr>
+          <w:p>
+            <w:r>
+              <w:t>功能需求</w:t>
+            </w:r>
+          </w:p>
+        </w:tc>
+        <w:tc>
+          <w:tcPr>
+            <w:tcW w:type="dxa" w:w="1729"/>
+          </w:tcPr>
+          <w:p>
+            <w:r>
+              <w:t>Given-When-Then 验收准则</w:t>
+            </w:r>
+          </w:p>
+        </w:tc>
+        <w:tc>
+          <w:tcPr>
+            <w:tcW w:type="dxa" w:w="1729"/>
+          </w:tcPr>
+          <w:p>
+            <w:r>
+              <w:t>Given 店员进入猫咪档案页 When 填写体温与情绪 Then 系统保存打卡记录；关联 UC-006；类图实体 CatProfile / HealthRecord</w:t>
+            </w:r>
+          </w:p>
+        </w:tc>
+        <w:tc>
+          <w:tcPr>
+            <w:tcW w:type="dxa" w:w="1729"/>
+          </w:tcPr>
+          <w:p>
+            <w:r>
+              <w:t>TC-016</w:t>
+            </w:r>
+          </w:p>
+        </w:tc>
+      </w:tr>
+      <w:tr>
+        <w:tc>
+          <w:tcPr>
+            <w:tcW w:type="dxa" w:w="1729"/>
+          </w:tcPr>
+          <w:p>
+            <w:r>
+              <w:t>FR-017</w:t>
+            </w:r>
+          </w:p>
+        </w:tc>
+        <w:tc>
+          <w:tcPr>
+            <w:tcW w:type="dxa" w:w="1729"/>
+          </w:tcPr>
+          <w:p>
+            <w:r>
+              <w:t>功能需求</w:t>
+            </w:r>
+          </w:p>
+        </w:tc>
+        <w:tc>
+          <w:tcPr>
+            <w:tcW w:type="dxa" w:w="1729"/>
+          </w:tcPr>
+          <w:p>
+            <w:r>
+              <w:t>Given-When-Then 验收准则</w:t>
+            </w:r>
+          </w:p>
+        </w:tc>
+        <w:tc>
+          <w:tcPr>
+            <w:tcW w:type="dxa" w:w="1729"/>
+          </w:tcPr>
+          <w:p>
+            <w:r>
+              <w:t>Given 店员查看猫咪列表 When 选择某只猫咪 Then 系统展示今日互动限制；关联 UC-006；类图实体 CatProfile</w:t>
+            </w:r>
+          </w:p>
+        </w:tc>
+        <w:tc>
+          <w:tcPr>
+            <w:tcW w:type="dxa" w:w="1729"/>
+          </w:tcPr>
+          <w:p>
+            <w:r>
+              <w:t>TC-017</w:t>
+            </w:r>
+          </w:p>
+        </w:tc>
+      </w:tr>
+      <w:tr>
+        <w:tc>
+          <w:tcPr>
+            <w:tcW w:type="dxa" w:w="1729"/>
+          </w:tcPr>
+          <w:p>
+            <w:r>
+              <w:t>FR-018</w:t>
+            </w:r>
+          </w:p>
+        </w:tc>
+        <w:tc>
+          <w:tcPr>
+            <w:tcW w:type="dxa" w:w="1729"/>
+          </w:tcPr>
+          <w:p>
+            <w:r>
+              <w:t>功能需求</w:t>
+            </w:r>
+          </w:p>
+        </w:tc>
+        <w:tc>
+          <w:tcPr>
+            <w:tcW w:type="dxa" w:w="1729"/>
+          </w:tcPr>
+          <w:p>
+            <w:r>
+              <w:t>Given-When-Then 验收准则</w:t>
+            </w:r>
+          </w:p>
+        </w:tc>
+        <w:tc>
+          <w:tcPr>
+            <w:tcW w:type="dxa" w:w="1729"/>
+          </w:tcPr>
+          <w:p>
+            <w:r>
+              <w:t>Given 店长进入门店配置 When 更新营业时间 Then 新时段立即参与预约计算；关联 UC-008；类图实体 BusinessCalendar</w:t>
+            </w:r>
+          </w:p>
+        </w:tc>
+        <w:tc>
+          <w:tcPr>
+            <w:tcW w:type="dxa" w:w="1729"/>
+          </w:tcPr>
+          <w:p>
+            <w:r>
+              <w:t>TC-018</w:t>
+            </w:r>
+          </w:p>
+        </w:tc>
+      </w:tr>
+      <w:tr>
+        <w:tc>
+          <w:tcPr>
+            <w:tcW w:type="dxa" w:w="1729"/>
+          </w:tcPr>
+          <w:p>
+            <w:r>
+              <w:t>FR-019</w:t>
+            </w:r>
+          </w:p>
+        </w:tc>
+        <w:tc>
+          <w:tcPr>
+            <w:tcW w:type="dxa" w:w="1729"/>
+          </w:tcPr>
+          <w:p>
+            <w:r>
+              <w:t>功能需求</w:t>
+            </w:r>
+          </w:p>
+        </w:tc>
+        <w:tc>
+          <w:tcPr>
+            <w:tcW w:type="dxa" w:w="1729"/>
+          </w:tcPr>
+          <w:p>
+            <w:r>
+              <w:t>Given-When-Then 验收准则</w:t>
+            </w:r>
+          </w:p>
+        </w:tc>
+        <w:tc>
+          <w:tcPr>
+            <w:tcW w:type="dxa" w:w="1729"/>
+          </w:tcPr>
+          <w:p>
+            <w:r>
+              <w:t>Given 门店调整桌位资源 When 保存配置 Then 系统刷新可预约资源池；关联 UC-008；类图实体 TableSlot</w:t>
+            </w:r>
+          </w:p>
+        </w:tc>
+        <w:tc>
+          <w:tcPr>
+            <w:tcW w:type="dxa" w:w="1729"/>
+          </w:tcPr>
+          <w:p>
+            <w:r>
+              <w:t>TC-019</w:t>
+            </w:r>
+          </w:p>
+        </w:tc>
+      </w:tr>
+      <w:tr>
+        <w:tc>
+          <w:tcPr>
+            <w:tcW w:type="dxa" w:w="1729"/>
+          </w:tcPr>
+          <w:p>
+            <w:r>
+              <w:t>FR-020</w:t>
+            </w:r>
+          </w:p>
+        </w:tc>
+        <w:tc>
+          <w:tcPr>
+            <w:tcW w:type="dxa" w:w="1729"/>
+          </w:tcPr>
+          <w:p>
+            <w:r>
+              <w:t>功能需求</w:t>
+            </w:r>
+          </w:p>
+        </w:tc>
+        <w:tc>
+          <w:tcPr>
+            <w:tcW w:type="dxa" w:w="1729"/>
+          </w:tcPr>
+          <w:p>
+            <w:r>
+              <w:t>Given-When-Then 验收准则</w:t>
+            </w:r>
+          </w:p>
+        </w:tc>
+        <w:tc>
+          <w:tcPr>
+            <w:tcW w:type="dxa" w:w="1729"/>
+          </w:tcPr>
+          <w:p>
+            <w:r>
+              <w:t>Given 运营创建活动 When 设定规则 Then 系统向目标会员展示活动入口；关联 UC-008；类图实体 ActivityCampaign</w:t>
+            </w:r>
+          </w:p>
+        </w:tc>
+        <w:tc>
+          <w:tcPr>
+            <w:tcW w:type="dxa" w:w="1729"/>
+          </w:tcPr>
+          <w:p>
+            <w:r>
+              <w:t>TC-020</w:t>
+            </w:r>
+          </w:p>
+        </w:tc>
+      </w:tr>
+      <w:tr>
+        <w:tc>
+          <w:tcPr>
+            <w:tcW w:type="dxa" w:w="1729"/>
+          </w:tcPr>
+          <w:p>
+            <w:r>
+              <w:t>FR-021</w:t>
+            </w:r>
+          </w:p>
+        </w:tc>
+        <w:tc>
+          <w:tcPr>
+            <w:tcW w:type="dxa" w:w="1729"/>
+          </w:tcPr>
+          <w:p>
+            <w:r>
+              <w:t>功能需求</w:t>
+            </w:r>
+          </w:p>
+        </w:tc>
+        <w:tc>
+          <w:tcPr>
+            <w:tcW w:type="dxa" w:w="1729"/>
+          </w:tcPr>
+          <w:p>
+            <w:r>
+              <w:t>Given-When-Then 验收准则</w:t>
+            </w:r>
+          </w:p>
+        </w:tc>
+        <w:tc>
+          <w:tcPr>
+            <w:tcW w:type="dxa" w:w="1729"/>
+          </w:tcPr>
+          <w:p>
+            <w:r>
+              <w:t>Given 运营进入数据看板 When 选择时间范围 Then 系统展示跨门店预约漏斗；关联 UC-008；类图实体 Reservation / ActivityCampaign</w:t>
+            </w:r>
+          </w:p>
+        </w:tc>
+        <w:tc>
+          <w:tcPr>
+            <w:tcW w:type="dxa" w:w="1729"/>
+          </w:tcPr>
+          <w:p>
+            <w:r>
+              <w:t>TC-021</w:t>
+            </w:r>
+          </w:p>
+        </w:tc>
+      </w:tr>
+      <w:tr>
+        <w:tc>
+          <w:tcPr>
+            <w:tcW w:type="dxa" w:w="1729"/>
+          </w:tcPr>
+          <w:p>
+            <w:r>
+              <w:t>FR-022</w:t>
+            </w:r>
+          </w:p>
+        </w:tc>
+        <w:tc>
+          <w:tcPr>
+            <w:tcW w:type="dxa" w:w="1729"/>
+          </w:tcPr>
+          <w:p>
+            <w:r>
+              <w:t>功能需求</w:t>
+            </w:r>
+          </w:p>
+        </w:tc>
+        <w:tc>
+          <w:tcPr>
+            <w:tcW w:type="dxa" w:w="1729"/>
+          </w:tcPr>
+          <w:p>
+            <w:r>
+              <w:t>Given-When-Then 验收准则</w:t>
+            </w:r>
+          </w:p>
+        </w:tc>
+        <w:tc>
+          <w:tcPr>
+            <w:tcW w:type="dxa" w:w="1729"/>
+          </w:tcPr>
+          <w:p>
+            <w:r>
+              <w:t>Given 运营查看经营指标 When 切换维度 Then 系统展示复购与活动拉动效果；关联 UC-008；类图实体 Member / ActivityCampaign</w:t>
+            </w:r>
+          </w:p>
+        </w:tc>
+        <w:tc>
+          <w:tcPr>
+            <w:tcW w:type="dxa" w:w="1729"/>
+          </w:tcPr>
+          <w:p>
+            <w:r>
+              <w:t>TC-022</w:t>
+            </w:r>
+          </w:p>
+        </w:tc>
+      </w:tr>
+      <w:tr>
+        <w:tc>
+          <w:tcPr>
+            <w:tcW w:type="dxa" w:w="1729"/>
+          </w:tcPr>
+          <w:p>
+            <w:r>
+              <w:t>FR-023</w:t>
+            </w:r>
+          </w:p>
+        </w:tc>
+        <w:tc>
+          <w:tcPr>
+            <w:tcW w:type="dxa" w:w="1729"/>
+          </w:tcPr>
+          <w:p>
+            <w:r>
+              <w:t>功能需求</w:t>
+            </w:r>
+          </w:p>
+        </w:tc>
+        <w:tc>
+          <w:tcPr>
+            <w:tcW w:type="dxa" w:w="1729"/>
+          </w:tcPr>
+          <w:p>
+            <w:r>
+              <w:t>Given-When-Then 验收准则</w:t>
+            </w:r>
+          </w:p>
+        </w:tc>
+        <w:tc>
+          <w:tcPr>
+            <w:tcW w:type="dxa" w:w="1729"/>
+          </w:tcPr>
+          <w:p>
+            <w:r>
+              <w:t>Given 顾客拥有有效预约 When 打开菜单 Then 系统允许提交预点单；关联 UC-010；类图实体 ReservationOrder</w:t>
+            </w:r>
+          </w:p>
+        </w:tc>
+        <w:tc>
+          <w:tcPr>
+            <w:tcW w:type="dxa" w:w="1729"/>
+          </w:tcPr>
+          <w:p>
+            <w:r>
+              <w:t>TC-023</w:t>
+            </w:r>
+          </w:p>
+        </w:tc>
+      </w:tr>
+      <w:tr>
+        <w:tc>
+          <w:tcPr>
+            <w:tcW w:type="dxa" w:w="1729"/>
+          </w:tcPr>
+          <w:p>
+            <w:r>
+              <w:t>FR-024</w:t>
+            </w:r>
+          </w:p>
+        </w:tc>
+        <w:tc>
+          <w:tcPr>
+            <w:tcW w:type="dxa" w:w="1729"/>
+          </w:tcPr>
+          <w:p>
+            <w:r>
+              <w:t>功能需求</w:t>
+            </w:r>
+          </w:p>
+        </w:tc>
+        <w:tc>
+          <w:tcPr>
+            <w:tcW w:type="dxa" w:w="1729"/>
+          </w:tcPr>
+          <w:p>
+            <w:r>
+              <w:t>Given-When-Then 验收准则</w:t>
+            </w:r>
+          </w:p>
+        </w:tc>
+        <w:tc>
+          <w:tcPr>
+            <w:tcW w:type="dxa" w:w="1729"/>
+          </w:tcPr>
+          <w:p>
+            <w:r>
+              <w:t>Given 顾客打开订单中心 When 查看某笔订单 Then 系统展示支付、备餐和核销状态；关联 UC-010；类图实体 ReservationOrder</w:t>
+            </w:r>
+          </w:p>
+        </w:tc>
+        <w:tc>
+          <w:tcPr>
+            <w:tcW w:type="dxa" w:w="1729"/>
+          </w:tcPr>
+          <w:p>
+            <w:r>
+              <w:t>TC-024</w:t>
+            </w:r>
+          </w:p>
+        </w:tc>
+      </w:tr>
+      <w:tr>
+        <w:tc>
+          <w:tcPr>
+            <w:tcW w:type="dxa" w:w="1729"/>
+          </w:tcPr>
+          <w:p>
+            <w:r>
+              <w:t>FR-025</w:t>
+            </w:r>
+          </w:p>
+        </w:tc>
+        <w:tc>
+          <w:tcPr>
+            <w:tcW w:type="dxa" w:w="1729"/>
+          </w:tcPr>
+          <w:p>
+            <w:r>
+              <w:t>功能需求</w:t>
+            </w:r>
+          </w:p>
+        </w:tc>
+        <w:tc>
+          <w:tcPr>
+            <w:tcW w:type="dxa" w:w="1729"/>
+          </w:tcPr>
+          <w:p>
+            <w:r>
+              <w:t>Given-When-Then 验收准则</w:t>
+            </w:r>
+          </w:p>
+        </w:tc>
+        <w:tc>
+          <w:tcPr>
+            <w:tcW w:type="dxa" w:w="1729"/>
+          </w:tcPr>
+          <w:p>
+            <w:r>
+              <w:t>Given 顾客未收到通知 When 店员点击补发 Then 系统重新触发消息任务；关联 UC-005；类图实体 NotificationTask</w:t>
+            </w:r>
+          </w:p>
+        </w:tc>
+        <w:tc>
+          <w:tcPr>
+            <w:tcW w:type="dxa" w:w="1729"/>
+          </w:tcPr>
+          <w:p>
+            <w:r>
+              <w:t>TC-025</w:t>
+            </w:r>
+          </w:p>
+        </w:tc>
+      </w:tr>
+      <w:tr>
+        <w:tc>
+          <w:tcPr>
+            <w:tcW w:type="dxa" w:w="1729"/>
+          </w:tcPr>
+          <w:p>
+            <w:r>
+              <w:t>FR-026</w:t>
+            </w:r>
+          </w:p>
+        </w:tc>
+        <w:tc>
+          <w:tcPr>
+            <w:tcW w:type="dxa" w:w="1729"/>
+          </w:tcPr>
+          <w:p>
+            <w:r>
+              <w:t>功能需求</w:t>
+            </w:r>
+          </w:p>
+        </w:tc>
+        <w:tc>
+          <w:tcPr>
+            <w:tcW w:type="dxa" w:w="1729"/>
+          </w:tcPr>
+          <w:p>
+            <w:r>
+              <w:t>Given-When-Then 验收准则</w:t>
+            </w:r>
+          </w:p>
+        </w:tc>
+        <w:tc>
+          <w:tcPr>
+            <w:tcW w:type="dxa" w:w="1729"/>
+          </w:tcPr>
+          <w:p>
+            <w:r>
+              <w:t>Given 店员处理异常 When 提交处置结果 Then 系统记录操作人、时间与原因；关联 UC-005；类图实体 AuditLog</w:t>
+            </w:r>
+          </w:p>
+        </w:tc>
+        <w:tc>
+          <w:tcPr>
+            <w:tcW w:type="dxa" w:w="1729"/>
+          </w:tcPr>
+          <w:p>
+            <w:r>
+              <w:t>TC-026</w:t>
+            </w:r>
+          </w:p>
+        </w:tc>
+      </w:tr>
+      <w:tr>
+        <w:tc>
+          <w:tcPr>
+            <w:tcW w:type="dxa" w:w="1729"/>
+          </w:tcPr>
+          <w:p>
+            <w:r>
+              <w:t>FR-027</w:t>
+            </w:r>
+          </w:p>
+        </w:tc>
+        <w:tc>
+          <w:tcPr>
+            <w:tcW w:type="dxa" w:w="1729"/>
+          </w:tcPr>
+          <w:p>
+            <w:r>
+              <w:t>功能需求</w:t>
+            </w:r>
+          </w:p>
+        </w:tc>
+        <w:tc>
+          <w:tcPr>
+            <w:tcW w:type="dxa" w:w="1729"/>
+          </w:tcPr>
+          <w:p>
+            <w:r>
+              <w:t>Given-When-Then 验收准则</w:t>
+            </w:r>
+          </w:p>
+        </w:tc>
+        <w:tc>
+          <w:tcPr>
+            <w:tcW w:type="dxa" w:w="1729"/>
+          </w:tcPr>
+          <w:p>
+            <w:r>
+              <w:t>Given 发送通知失败 When 满足重试策略 Then 系统自动进入重试队列；关联 UC-003；类图实体 NotificationTask</w:t>
+            </w:r>
+          </w:p>
+        </w:tc>
+        <w:tc>
+          <w:tcPr>
+            <w:tcW w:type="dxa" w:w="1729"/>
+          </w:tcPr>
+          <w:p>
+            <w:r>
+              <w:t>TC-027</w:t>
+            </w:r>
+          </w:p>
+        </w:tc>
+      </w:tr>
+      <w:tr>
+        <w:tc>
+          <w:tcPr>
+            <w:tcW w:type="dxa" w:w="1729"/>
+          </w:tcPr>
+          <w:p>
+            <w:r>
+              <w:t>FR-028</w:t>
+            </w:r>
+          </w:p>
+        </w:tc>
+        <w:tc>
+          <w:tcPr>
+            <w:tcW w:type="dxa" w:w="1729"/>
+          </w:tcPr>
+          <w:p>
+            <w:r>
+              <w:t>功能需求</w:t>
+            </w:r>
+          </w:p>
+        </w:tc>
+        <w:tc>
+          <w:tcPr>
+            <w:tcW w:type="dxa" w:w="1729"/>
+          </w:tcPr>
+          <w:p>
+            <w:r>
+              <w:t>Given-When-Then 验收准则</w:t>
+            </w:r>
+          </w:p>
+        </w:tc>
+        <w:tc>
+          <w:tcPr>
+            <w:tcW w:type="dxa" w:w="1729"/>
+          </w:tcPr>
+          <w:p>
+            <w:r>
+              <w:t>Given 管理员访问敏感数据 When 执行查询或导出 Then 系统记录审计日志；关联 UC-008；类图实体 AuditLog</w:t>
+            </w:r>
+          </w:p>
+        </w:tc>
+        <w:tc>
+          <w:tcPr>
+            <w:tcW w:type="dxa" w:w="1729"/>
+          </w:tcPr>
+          <w:p>
+            <w:r>
+              <w:t>TC-028</w:t>
+            </w:r>
+          </w:p>
+        </w:tc>
+      </w:tr>
+      <w:tr>
+        <w:tc>
+          <w:tcPr>
+            <w:tcW w:type="dxa" w:w="1729"/>
+          </w:tcPr>
+          <w:p>
+            <w:r>
+              <w:t>FR-029</w:t>
+            </w:r>
+          </w:p>
+        </w:tc>
+        <w:tc>
+          <w:tcPr>
+            <w:tcW w:type="dxa" w:w="1729"/>
+          </w:tcPr>
+          <w:p>
+            <w:r>
+              <w:t>功能需求</w:t>
+            </w:r>
+          </w:p>
+        </w:tc>
+        <w:tc>
+          <w:tcPr>
+            <w:tcW w:type="dxa" w:w="1729"/>
+          </w:tcPr>
+          <w:p>
+            <w:r>
+              <w:t>Given-When-Then 验收准则</w:t>
+            </w:r>
+          </w:p>
+        </w:tc>
+        <w:tc>
+          <w:tcPr>
+            <w:tcW w:type="dxa" w:w="1729"/>
+          </w:tcPr>
+          <w:p>
+            <w:r>
+              <w:t>Given 推荐服务返回结果 When 顾客查看详情 Then 系统展示可理解的推荐理由；关联 UC-007；类图实体 RecommendationRule</w:t>
+            </w:r>
+          </w:p>
+        </w:tc>
+        <w:tc>
+          <w:tcPr>
+            <w:tcW w:type="dxa" w:w="1729"/>
+          </w:tcPr>
+          <w:p>
+            <w:r>
+              <w:t>TC-029</w:t>
+            </w:r>
+          </w:p>
+        </w:tc>
+      </w:tr>
+      <w:tr>
+        <w:tc>
+          <w:tcPr>
+            <w:tcW w:type="dxa" w:w="1729"/>
+          </w:tcPr>
+          <w:p>
+            <w:r>
+              <w:t>FR-030</w:t>
+            </w:r>
+          </w:p>
+        </w:tc>
+        <w:tc>
+          <w:tcPr>
+            <w:tcW w:type="dxa" w:w="1729"/>
+          </w:tcPr>
+          <w:p>
+            <w:r>
+              <w:t>功能需求</w:t>
+            </w:r>
+          </w:p>
+        </w:tc>
+        <w:tc>
+          <w:tcPr>
+            <w:tcW w:type="dxa" w:w="1729"/>
+          </w:tcPr>
+          <w:p>
+            <w:r>
+              <w:t>Given-When-Then 验收准则</w:t>
+            </w:r>
+          </w:p>
+        </w:tc>
+        <w:tc>
+          <w:tcPr>
+            <w:tcW w:type="dxa" w:w="1729"/>
+          </w:tcPr>
+          <w:p>
+            <w:r>
+              <w:t>Given 预约状态变化 When 顾客入座或离店 Then 桌位资源池同步更新；关联 UC-005；类图实体 TableSlot / ReservationOrder</w:t>
+            </w:r>
+          </w:p>
+        </w:tc>
+        <w:tc>
+          <w:tcPr>
+            <w:tcW w:type="dxa" w:w="1729"/>
+          </w:tcPr>
+          <w:p>
+            <w:r>
+              <w:t>TC-030</w:t>
+            </w:r>
+          </w:p>
+        </w:tc>
+      </w:tr>
+      <w:tr>
+        <w:tc>
+          <w:tcPr>
+            <w:tcW w:type="dxa" w:w="1729"/>
+          </w:tcPr>
+          <w:p>
+            <w:r>
+              <w:t>NFR-001</w:t>
+            </w:r>
+          </w:p>
+        </w:tc>
+        <w:tc>
+          <w:tcPr>
+            <w:tcW w:type="dxa" w:w="1729"/>
+          </w:tcPr>
+          <w:p>
+            <w:r>
+              <w:t>非功能需求</w:t>
+            </w:r>
+          </w:p>
+        </w:tc>
+        <w:tc>
+          <w:tcPr>
+            <w:tcW w:type="dxa" w:w="1729"/>
+          </w:tcPr>
+          <w:p>
+            <w:r>
+              <w:t>度量指标 + 验证方法</w:t>
+            </w:r>
+          </w:p>
+        </w:tc>
+        <w:tc>
+          <w:tcPr>
+            <w:tcW w:type="dxa" w:w="1729"/>
+          </w:tcPr>
+          <w:p>
+            <w:r>
+              <w:t>峰值 5000 QPS 下错误率低于 1%；验证方式：k6 压测；上下文：BC-RESERVATION</w:t>
+            </w:r>
+          </w:p>
+        </w:tc>
+        <w:tc>
+          <w:tcPr>
+            <w:tcW w:type="dxa" w:w="1729"/>
+          </w:tcPr>
+          <w:p>
+            <w:r>
+              <w:t>TC-NFR-01</w:t>
+            </w:r>
+          </w:p>
+        </w:tc>
+      </w:tr>
+      <w:tr>
+        <w:tc>
+          <w:tcPr>
+            <w:tcW w:type="dxa" w:w="1729"/>
+          </w:tcPr>
+          <w:p>
+            <w:r>
+              <w:t>NFR-002</w:t>
+            </w:r>
+          </w:p>
+        </w:tc>
+        <w:tc>
+          <w:tcPr>
+            <w:tcW w:type="dxa" w:w="1729"/>
+          </w:tcPr>
+          <w:p>
+            <w:r>
+              <w:t>非功能需求</w:t>
+            </w:r>
+          </w:p>
+        </w:tc>
+        <w:tc>
+          <w:tcPr>
+            <w:tcW w:type="dxa" w:w="1729"/>
+          </w:tcPr>
+          <w:p>
+            <w:r>
+              <w:t>度量指标 + 验证方法</w:t>
+            </w:r>
+          </w:p>
+        </w:tc>
+        <w:tc>
+          <w:tcPr>
+            <w:tcW w:type="dxa" w:w="1729"/>
+          </w:tcPr>
+          <w:p>
+            <w:r>
+              <w:t>月度可用性 &gt;= 99.9%；验证方式：Prometheus + SLO 报告；上下文：BC-RESERVATION</w:t>
+            </w:r>
+          </w:p>
+        </w:tc>
+        <w:tc>
+          <w:tcPr>
+            <w:tcW w:type="dxa" w:w="1729"/>
+          </w:tcPr>
+          <w:p>
+            <w:r>
+              <w:t>TC-NFR-02</w:t>
+            </w:r>
+          </w:p>
+        </w:tc>
+      </w:tr>
+      <w:tr>
+        <w:tc>
+          <w:tcPr>
+            <w:tcW w:type="dxa" w:w="1729"/>
+          </w:tcPr>
+          <w:p>
+            <w:r>
+              <w:t>NFR-003</w:t>
+            </w:r>
+          </w:p>
+        </w:tc>
+        <w:tc>
+          <w:tcPr>
+            <w:tcW w:type="dxa" w:w="1729"/>
+          </w:tcPr>
+          <w:p>
+            <w:r>
+              <w:t>非功能需求</w:t>
+            </w:r>
+          </w:p>
+        </w:tc>
+        <w:tc>
+          <w:tcPr>
+            <w:tcW w:type="dxa" w:w="1729"/>
+          </w:tcPr>
+          <w:p>
+            <w:r>
+              <w:t>度量指标 + 验证方法</w:t>
+            </w:r>
+          </w:p>
+        </w:tc>
+        <w:tc>
+          <w:tcPr>
+            <w:tcW w:type="dxa" w:w="1729"/>
+          </w:tcPr>
+          <w:p>
+            <w:r>
+              <w:t>敏感字段具备权限控制与脱敏规则；验证方式：安全测试 + 合规审查；上下文：BC-MEMBER</w:t>
+            </w:r>
+          </w:p>
+        </w:tc>
+        <w:tc>
+          <w:tcPr>
+            <w:tcW w:type="dxa" w:w="1729"/>
+          </w:tcPr>
+          <w:p>
+            <w:r>
+              <w:t>TC-NFR-03</w:t>
+            </w:r>
+          </w:p>
+        </w:tc>
+      </w:tr>
+      <w:tr>
+        <w:tc>
+          <w:tcPr>
+            <w:tcW w:type="dxa" w:w="1729"/>
+          </w:tcPr>
+          <w:p>
+            <w:r>
+              <w:t>NFR-004</w:t>
+            </w:r>
+          </w:p>
+        </w:tc>
+        <w:tc>
+          <w:tcPr>
+            <w:tcW w:type="dxa" w:w="1729"/>
+          </w:tcPr>
+          <w:p>
+            <w:r>
+              <w:t>非功能需求</w:t>
+            </w:r>
+          </w:p>
+        </w:tc>
+        <w:tc>
+          <w:tcPr>
+            <w:tcW w:type="dxa" w:w="1729"/>
+          </w:tcPr>
+          <w:p>
+            <w:r>
+              <w:t>度量指标 + 验证方法</w:t>
+            </w:r>
+          </w:p>
+        </w:tc>
+        <w:tc>
+          <w:tcPr>
+            <w:tcW w:type="dxa" w:w="1729"/>
+          </w:tcPr>
+          <w:p>
+            <w:r>
+              <w:t>配置变更发布过程不影响已有门店服务；验证方式：变更演练；上下文：BC-STORE-OPS</w:t>
+            </w:r>
+          </w:p>
+        </w:tc>
+        <w:tc>
+          <w:tcPr>
+            <w:tcW w:type="dxa" w:w="1729"/>
+          </w:tcPr>
+          <w:p>
+            <w:r>
+              <w:t>TC-NFR-04</w:t>
+            </w:r>
+          </w:p>
+        </w:tc>
+      </w:tr>
+      <w:tr>
+        <w:tc>
+          <w:tcPr>
+            <w:tcW w:type="dxa" w:w="1729"/>
+          </w:tcPr>
+          <w:p>
+            <w:r>
+              <w:t>NFR-005</w:t>
+            </w:r>
+          </w:p>
+        </w:tc>
+        <w:tc>
+          <w:tcPr>
+            <w:tcW w:type="dxa" w:w="1729"/>
+          </w:tcPr>
+          <w:p>
+            <w:r>
+              <w:t>非功能需求</w:t>
+            </w:r>
+          </w:p>
+        </w:tc>
+        <w:tc>
+          <w:tcPr>
+            <w:tcW w:type="dxa" w:w="1729"/>
+          </w:tcPr>
+          <w:p>
+            <w:r>
+              <w:t>度量指标 + 验证方法</w:t>
+            </w:r>
+          </w:p>
+        </w:tc>
+        <w:tc>
+          <w:tcPr>
+            <w:tcW w:type="dxa" w:w="1729"/>
+          </w:tcPr>
+          <w:p>
+            <w:r>
+              <w:t>完成预约的主流程不超过 3 个关键操作页面；验证方式：可用性走查；上下文：BC-RESERVATION</w:t>
+            </w:r>
+          </w:p>
+        </w:tc>
+        <w:tc>
+          <w:tcPr>
+            <w:tcW w:type="dxa" w:w="1729"/>
+          </w:tcPr>
+          <w:p>
+            <w:r>
+              <w:t>TC-NFR-05</w:t>
+            </w:r>
+          </w:p>
+        </w:tc>
+      </w:tr>
+      <w:tr>
+        <w:tc>
+          <w:tcPr>
+            <w:tcW w:type="dxa" w:w="1729"/>
+          </w:tcPr>
+          <w:p>
+            <w:r>
+              <w:t>NFR-006</w:t>
+            </w:r>
+          </w:p>
+        </w:tc>
+        <w:tc>
+          <w:tcPr>
+            <w:tcW w:type="dxa" w:w="1729"/>
+          </w:tcPr>
+          <w:p>
+            <w:r>
+              <w:t>非功能需求</w:t>
+            </w:r>
+          </w:p>
+        </w:tc>
+        <w:tc>
+          <w:tcPr>
+            <w:tcW w:type="dxa" w:w="1729"/>
+          </w:tcPr>
+          <w:p>
+            <w:r>
+              <w:t>度量指标 + 验证方法</w:t>
+            </w:r>
+          </w:p>
+        </w:tc>
+        <w:tc>
+          <w:tcPr>
+            <w:tcW w:type="dxa" w:w="1729"/>
+          </w:tcPr>
+          <w:p>
+            <w:r>
+              <w:t>覆盖 iOS Safari、Android Chrome、微信小程序；验证方式：兼容性测试；上下文：BC-RESERVATION</w:t>
+            </w:r>
+          </w:p>
+        </w:tc>
+        <w:tc>
+          <w:tcPr>
+            <w:tcW w:type="dxa" w:w="1729"/>
+          </w:tcPr>
+          <w:p>
+            <w:r>
+              <w:t>TC-NFR-06</w:t>
+            </w:r>
+          </w:p>
+        </w:tc>
+      </w:tr>
+      <w:tr>
+        <w:tc>
+          <w:tcPr>
+            <w:tcW w:type="dxa" w:w="1729"/>
+          </w:tcPr>
+          <w:p>
+            <w:r>
+              <w:t>NFR-007</w:t>
+            </w:r>
+          </w:p>
+        </w:tc>
+        <w:tc>
+          <w:tcPr>
+            <w:tcW w:type="dxa" w:w="1729"/>
+          </w:tcPr>
+          <w:p>
+            <w:r>
+              <w:t>非功能需求</w:t>
+            </w:r>
+          </w:p>
+        </w:tc>
+        <w:tc>
+          <w:tcPr>
+            <w:tcW w:type="dxa" w:w="1729"/>
+          </w:tcPr>
+          <w:p>
+            <w:r>
+              <w:t>度量指标 + 验证方法</w:t>
+            </w:r>
+          </w:p>
+        </w:tc>
+        <w:tc>
+          <w:tcPr>
+            <w:tcW w:type="dxa" w:w="1729"/>
+          </w:tcPr>
+          <w:p>
+            <w:r>
+              <w:t>敏感操作日志保留 &gt;= 180 天且支持检索；验证方式：日志审计检查；上下文：BC-OPERATIONS</w:t>
+            </w:r>
+          </w:p>
+        </w:tc>
+        <w:tc>
+          <w:tcPr>
+            <w:tcW w:type="dxa" w:w="1729"/>
+          </w:tcPr>
+          <w:p>
+            <w:r>
+              <w:t>TC-NFR-07</w:t>
+            </w:r>
+          </w:p>
+        </w:tc>
+      </w:tr>
+      <w:tr>
+        <w:tc>
+          <w:tcPr>
+            <w:tcW w:type="dxa" w:w="1729"/>
+          </w:tcPr>
+          <w:p>
+            <w:r>
+              <w:t>NFR-008</w:t>
+            </w:r>
+          </w:p>
+        </w:tc>
+        <w:tc>
+          <w:tcPr>
+            <w:tcW w:type="dxa" w:w="1729"/>
+          </w:tcPr>
+          <w:p>
+            <w:r>
+              <w:t>非功能需求</w:t>
+            </w:r>
+          </w:p>
+        </w:tc>
+        <w:tc>
+          <w:tcPr>
+            <w:tcW w:type="dxa" w:w="1729"/>
+          </w:tcPr>
+          <w:p>
+            <w:r>
+              <w:t>度量指标 + 验证方法</w:t>
+            </w:r>
+          </w:p>
+        </w:tc>
+        <w:tc>
+          <w:tcPr>
+            <w:tcW w:type="dxa" w:w="1729"/>
+          </w:tcPr>
+          <w:p>
+            <w:r>
+              <w:t>服务镜像化后可在统一运行环境启动；验证方式：容器化验证；上下文：BC-RESERVATION</w:t>
+            </w:r>
+          </w:p>
+        </w:tc>
+        <w:tc>
+          <w:tcPr>
+            <w:tcW w:type="dxa" w:w="1729"/>
+          </w:tcPr>
+          <w:p>
+            <w:r>
+              <w:t>TC-NFR-08</w:t>
+            </w:r>
+          </w:p>
+        </w:tc>
+      </w:tr>
+      <w:tr>
+        <w:tc>
+          <w:tcPr>
+            <w:tcW w:type="dxa" w:w="1729"/>
+          </w:tcPr>
+          <w:p>
+            <w:r>
+              <w:t>NFR-009</w:t>
+            </w:r>
+          </w:p>
+        </w:tc>
+        <w:tc>
+          <w:tcPr>
+            <w:tcW w:type="dxa" w:w="1729"/>
+          </w:tcPr>
+          <w:p>
+            <w:r>
+              <w:t>非功能需求</w:t>
+            </w:r>
+          </w:p>
+        </w:tc>
+        <w:tc>
+          <w:tcPr>
+            <w:tcW w:type="dxa" w:w="1729"/>
+          </w:tcPr>
+          <w:p>
+            <w:r>
+              <w:t>度量指标 + 验证方法</w:t>
+            </w:r>
+          </w:p>
+        </w:tc>
+        <w:tc>
+          <w:tcPr>
+            <w:tcW w:type="dxa" w:w="1729"/>
+          </w:tcPr>
+          <w:p>
+            <w:r>
+              <w:t>P95 推荐响应时间 &lt;= 2s 且解释字段非空；验证方式：接口测试；上下文：BC-RECOMMENDATION</w:t>
+            </w:r>
+          </w:p>
+        </w:tc>
+        <w:tc>
+          <w:tcPr>
+            <w:tcW w:type="dxa" w:w="1729"/>
+          </w:tcPr>
+          <w:p>
+            <w:r>
+              <w:t>TC-NFR-09</w:t>
+            </w:r>
+          </w:p>
+        </w:tc>
+      </w:tr>
+      <w:tr>
+        <w:tc>
+          <w:tcPr>
+            <w:tcW w:type="dxa" w:w="1729"/>
+          </w:tcPr>
+          <w:p>
+            <w:r>
+              <w:t>NFR-010</w:t>
+            </w:r>
+          </w:p>
+        </w:tc>
+        <w:tc>
+          <w:tcPr>
+            <w:tcW w:type="dxa" w:w="1729"/>
+          </w:tcPr>
+          <w:p>
+            <w:r>
+              <w:t>非功能需求</w:t>
+            </w:r>
+          </w:p>
+        </w:tc>
+        <w:tc>
+          <w:tcPr>
+            <w:tcW w:type="dxa" w:w="1729"/>
+          </w:tcPr>
+          <w:p>
+            <w:r>
+              <w:t>度量指标 + 验证方法</w:t>
+            </w:r>
+          </w:p>
+        </w:tc>
+        <w:tc>
+          <w:tcPr>
+            <w:tcW w:type="dxa" w:w="1729"/>
+          </w:tcPr>
+          <w:p>
+            <w:r>
+              <w:t>异常预约在后台列表中 1 秒内可识别；验证方式：可用性走查；上下文：BC-STORE-OPS</w:t>
+            </w:r>
+          </w:p>
+        </w:tc>
+        <w:tc>
+          <w:tcPr>
+            <w:tcW w:type="dxa" w:w="1729"/>
+          </w:tcPr>
+          <w:p>
+            <w:r>
+              <w:t>TC-NFR-10</w:t>
+            </w:r>
+          </w:p>
+        </w:tc>
+      </w:tr>
+    </w:tbl>
     <w:p>
       <w:pPr>
         <w:pStyle w:val="Heading1"/>

</xml_diff>

<commit_message>
fix(lab1): add defect resolution evidence
</commit_message>
<xml_diff>
--- a/docs/lab1/source/计算机23-2_231002208_戚晋瑜_实验一_ValidationReport_v1.0.docx
+++ b/docs/lab1/source/计算机23-2_231002208_戚晋瑜_实验一_ValidationReport_v1.0.docx
@@ -3019,15 +3019,16 @@
         <w:tblLook w:firstColumn="1" w:firstRow="1" w:lastColumn="0" w:lastRow="0" w:noHBand="0" w:noVBand="1" w:val="04A0"/>
       </w:tblPr>
       <w:tblGrid>
-        <w:gridCol w:w="2161"/>
-        <w:gridCol w:w="2161"/>
-        <w:gridCol w:w="2161"/>
-        <w:gridCol w:w="2161"/>
+        <w:gridCol w:w="1729"/>
+        <w:gridCol w:w="1729"/>
+        <w:gridCol w:w="1729"/>
+        <w:gridCol w:w="1729"/>
+        <w:gridCol w:w="1729"/>
       </w:tblGrid>
       <w:tr>
         <w:tc>
           <w:tcPr>
-            <w:tcW w:type="dxa" w:w="2161"/>
+            <w:tcW w:type="dxa" w:w="1729"/>
           </w:tcPr>
           <w:p>
             <w:r>
@@ -3037,7 +3038,7 @@
         </w:tc>
         <w:tc>
           <w:tcPr>
-            <w:tcW w:type="dxa" w:w="2161"/>
+            <w:tcW w:type="dxa" w:w="1729"/>
           </w:tcPr>
           <w:p>
             <w:r>
@@ -3047,7 +3048,7 @@
         </w:tc>
         <w:tc>
           <w:tcPr>
-            <w:tcW w:type="dxa" w:w="2161"/>
+            <w:tcW w:type="dxa" w:w="1729"/>
           </w:tcPr>
           <w:p>
             <w:r>
@@ -3057,7 +3058,17 @@
         </w:tc>
         <w:tc>
           <w:tcPr>
-            <w:tcW w:type="dxa" w:w="2161"/>
+            <w:tcW w:type="dxa" w:w="1729"/>
+          </w:tcPr>
+          <w:p>
+            <w:r>
+              <w:t>修复依据</w:t>
+            </w:r>
+          </w:p>
+        </w:tc>
+        <w:tc>
+          <w:tcPr>
+            <w:tcW w:type="dxa" w:w="1729"/>
           </w:tcPr>
           <w:p>
             <w:r>
@@ -3069,7 +3080,7 @@
       <w:tr>
         <w:tc>
           <w:tcPr>
-            <w:tcW w:type="dxa" w:w="2161"/>
+            <w:tcW w:type="dxa" w:w="1729"/>
           </w:tcPr>
           <w:p>
             <w:r>
@@ -3079,7 +3090,7 @@
         </w:tc>
         <w:tc>
           <w:tcPr>
-            <w:tcW w:type="dxa" w:w="2161"/>
+            <w:tcW w:type="dxa" w:w="1729"/>
           </w:tcPr>
           <w:p>
             <w:r>
@@ -3089,7 +3100,7 @@
         </w:tc>
         <w:tc>
           <w:tcPr>
-            <w:tcW w:type="dxa" w:w="2161"/>
+            <w:tcW w:type="dxa" w:w="1729"/>
           </w:tcPr>
           <w:p>
             <w:r>
@@ -3099,7 +3110,17 @@
         </w:tc>
         <w:tc>
           <w:tcPr>
-            <w:tcW w:type="dxa" w:w="2161"/>
+            <w:tcW w:type="dxa" w:w="1729"/>
+          </w:tcPr>
+          <w:p>
+            <w:r>
+              <w:t>FR-006 对应条目已在 D1-2 / D1-3 / D1-5 v1.0 中修订</w:t>
+            </w:r>
+          </w:p>
+        </w:tc>
+        <w:tc>
+          <w:tcPr>
+            <w:tcW w:type="dxa" w:w="1729"/>
           </w:tcPr>
           <w:p>
             <w:r>
@@ -3111,7 +3132,7 @@
       <w:tr>
         <w:tc>
           <w:tcPr>
-            <w:tcW w:type="dxa" w:w="2161"/>
+            <w:tcW w:type="dxa" w:w="1729"/>
           </w:tcPr>
           <w:p>
             <w:r>
@@ -3121,7 +3142,7 @@
         </w:tc>
         <w:tc>
           <w:tcPr>
-            <w:tcW w:type="dxa" w:w="2161"/>
+            <w:tcW w:type="dxa" w:w="1729"/>
           </w:tcPr>
           <w:p>
             <w:r>
@@ -3131,7 +3152,7 @@
         </w:tc>
         <w:tc>
           <w:tcPr>
-            <w:tcW w:type="dxa" w:w="2161"/>
+            <w:tcW w:type="dxa" w:w="1729"/>
           </w:tcPr>
           <w:p>
             <w:r>
@@ -3141,7 +3162,17 @@
         </w:tc>
         <w:tc>
           <w:tcPr>
-            <w:tcW w:type="dxa" w:w="2161"/>
+            <w:tcW w:type="dxa" w:w="1729"/>
+          </w:tcPr>
+          <w:p>
+            <w:r>
+              <w:t>FR-004 ↔ FR-015 对应条目已在 D1-2 / D1-3 / D1-5 v1.0 中修订</w:t>
+            </w:r>
+          </w:p>
+        </w:tc>
+        <w:tc>
+          <w:tcPr>
+            <w:tcW w:type="dxa" w:w="1729"/>
           </w:tcPr>
           <w:p>
             <w:r>
@@ -3153,7 +3184,7 @@
       <w:tr>
         <w:tc>
           <w:tcPr>
-            <w:tcW w:type="dxa" w:w="2161"/>
+            <w:tcW w:type="dxa" w:w="1729"/>
           </w:tcPr>
           <w:p>
             <w:r>
@@ -3163,7 +3194,7 @@
         </w:tc>
         <w:tc>
           <w:tcPr>
-            <w:tcW w:type="dxa" w:w="2161"/>
+            <w:tcW w:type="dxa" w:w="1729"/>
           </w:tcPr>
           <w:p>
             <w:r>
@@ -3173,7 +3204,7 @@
         </w:tc>
         <w:tc>
           <w:tcPr>
-            <w:tcW w:type="dxa" w:w="2161"/>
+            <w:tcW w:type="dxa" w:w="1729"/>
           </w:tcPr>
           <w:p>
             <w:r>
@@ -3183,7 +3214,17 @@
         </w:tc>
         <w:tc>
           <w:tcPr>
-            <w:tcW w:type="dxa" w:w="2161"/>
+            <w:tcW w:type="dxa" w:w="1729"/>
+          </w:tcPr>
+          <w:p>
+            <w:r>
+              <w:t>FR-009 对应条目已在 D1-2 / D1-3 / D1-5 v1.0 中修订</w:t>
+            </w:r>
+          </w:p>
+        </w:tc>
+        <w:tc>
+          <w:tcPr>
+            <w:tcW w:type="dxa" w:w="1729"/>
           </w:tcPr>
           <w:p>
             <w:r>
@@ -3195,7 +3236,7 @@
       <w:tr>
         <w:tc>
           <w:tcPr>
-            <w:tcW w:type="dxa" w:w="2161"/>
+            <w:tcW w:type="dxa" w:w="1729"/>
           </w:tcPr>
           <w:p>
             <w:r>
@@ -3205,7 +3246,7 @@
         </w:tc>
         <w:tc>
           <w:tcPr>
-            <w:tcW w:type="dxa" w:w="2161"/>
+            <w:tcW w:type="dxa" w:w="1729"/>
           </w:tcPr>
           <w:p>
             <w:r>
@@ -3215,7 +3256,7 @@
         </w:tc>
         <w:tc>
           <w:tcPr>
-            <w:tcW w:type="dxa" w:w="2161"/>
+            <w:tcW w:type="dxa" w:w="1729"/>
           </w:tcPr>
           <w:p>
             <w:r>
@@ -3225,7 +3266,17 @@
         </w:tc>
         <w:tc>
           <w:tcPr>
-            <w:tcW w:type="dxa" w:w="2161"/>
+            <w:tcW w:type="dxa" w:w="1729"/>
+          </w:tcPr>
+          <w:p>
+            <w:r>
+              <w:t>NFR-005 对应条目已在 D1-2 / D1-3 / D1-5 v1.0 中修订</w:t>
+            </w:r>
+          </w:p>
+        </w:tc>
+        <w:tc>
+          <w:tcPr>
+            <w:tcW w:type="dxa" w:w="1729"/>
           </w:tcPr>
           <w:p>
             <w:r>
@@ -3237,7 +3288,7 @@
       <w:tr>
         <w:tc>
           <w:tcPr>
-            <w:tcW w:type="dxa" w:w="2161"/>
+            <w:tcW w:type="dxa" w:w="1729"/>
           </w:tcPr>
           <w:p>
             <w:r>
@@ -3247,7 +3298,7 @@
         </w:tc>
         <w:tc>
           <w:tcPr>
-            <w:tcW w:type="dxa" w:w="2161"/>
+            <w:tcW w:type="dxa" w:w="1729"/>
           </w:tcPr>
           <w:p>
             <w:r>
@@ -3257,7 +3308,7 @@
         </w:tc>
         <w:tc>
           <w:tcPr>
-            <w:tcW w:type="dxa" w:w="2161"/>
+            <w:tcW w:type="dxa" w:w="1729"/>
           </w:tcPr>
           <w:p>
             <w:r>
@@ -3267,7 +3318,17 @@
         </w:tc>
         <w:tc>
           <w:tcPr>
-            <w:tcW w:type="dxa" w:w="2161"/>
+            <w:tcW w:type="dxa" w:w="1729"/>
+          </w:tcPr>
+          <w:p>
+            <w:r>
+              <w:t>UC-006 对应条目已在 D1-2 / D1-3 / D1-5 v1.0 中修订</w:t>
+            </w:r>
+          </w:p>
+        </w:tc>
+        <w:tc>
+          <w:tcPr>
+            <w:tcW w:type="dxa" w:w="1729"/>
           </w:tcPr>
           <w:p>
             <w:r>
@@ -3279,7 +3340,7 @@
       <w:tr>
         <w:tc>
           <w:tcPr>
-            <w:tcW w:type="dxa" w:w="2161"/>
+            <w:tcW w:type="dxa" w:w="1729"/>
           </w:tcPr>
           <w:p>
             <w:r>
@@ -3289,7 +3350,7 @@
         </w:tc>
         <w:tc>
           <w:tcPr>
-            <w:tcW w:type="dxa" w:w="2161"/>
+            <w:tcW w:type="dxa" w:w="1729"/>
           </w:tcPr>
           <w:p>
             <w:r>
@@ -3299,7 +3360,7 @@
         </w:tc>
         <w:tc>
           <w:tcPr>
-            <w:tcW w:type="dxa" w:w="2161"/>
+            <w:tcW w:type="dxa" w:w="1729"/>
           </w:tcPr>
           <w:p>
             <w:r>
@@ -3309,7 +3370,17 @@
         </w:tc>
         <w:tc>
           <w:tcPr>
-            <w:tcW w:type="dxa" w:w="2161"/>
+            <w:tcW w:type="dxa" w:w="1729"/>
+          </w:tcPr>
+          <w:p>
+            <w:r>
+              <w:t>保留到实验二继续评审并补充修订依据</w:t>
+            </w:r>
+          </w:p>
+        </w:tc>
+        <w:tc>
+          <w:tcPr>
+            <w:tcW w:type="dxa" w:w="1729"/>
           </w:tcPr>
           <w:p>
             <w:r>

</xml_diff>